<commit_message>
chore: sync local improvements for vehicle-database and report-generation
- vehicle-database/importers: improve column matching, vehicle info field
  mapping, and condition name updates
- vehicle-report-generation: add D挡 compatibility and cross-drive image
  path resolution
</commit_message>
<xml_diff>
--- a/vehicle-report-generation/templates/ripple_report_template.docx
+++ b/vehicle-report-generation/templates/ripple_report_template.docx
@@ -354,7 +354,7 @@
                 <w:rFonts w:hint="eastAsia"/>
                 <w:szCs w:val="20"/>
               </w:rPr>
-              <w:t>停车D档工况</w:t>
+              <w:t>停车D挡工况</w:t>
             </w:r>
           </w:p>
         </w:tc>
@@ -437,7 +437,7 @@
                 <w:rFonts w:hint="eastAsia"/>
                 <w:szCs w:val="20"/>
               </w:rPr>
-              <w:t>1）整车档位挂在D档，通过刹车使整车处于静止状态，车速为0km</w:t>
+              <w:t>1）整车挡位挂在D挡，通过刹车使整车处于静止状态，车速为0km</w:t>
             </w:r>
             <w:r>
               <w:rPr>
@@ -502,7 +502,7 @@
                 <w:rFonts w:hint="eastAsia"/>
                 <w:szCs w:val="20"/>
               </w:rPr>
-              <w:t>2）整车档位挂在D档，通过刹车使整车处于静止状态，车速为0km</w:t>
+              <w:t>2）整车挡位挂在D挡，通过刹车使整车处于静止状态，车速为0km</w:t>
             </w:r>
             <w:r>
               <w:rPr>
@@ -809,7 +809,7 @@
                 <w:rFonts w:hint="eastAsia"/>
                 <w:lang w:eastAsia="zh-CN"/>
               </w:rPr>
-              <w:t>1）整车档位挂在D档，加速踏板开度百分之百，使车速由0加速至100km/h；</w:t>
+              <w:t>1）整车挡位挂在D挡，加速踏板开度百分之百，使车速由0加速至100km/h；</w:t>
             </w:r>
           </w:p>
           <w:p>
@@ -830,7 +830,7 @@
                 <w:rFonts w:hint="eastAsia"/>
                 <w:lang w:eastAsia="zh-CN"/>
               </w:rPr>
-              <w:t>2）整车档位挂在D档，加速踏板开度百分之百</w:t>
+              <w:t>2）整车挡位挂在D挡，加速踏板开度百分之百</w:t>
             </w:r>
             <w:r>
               <w:rPr>
@@ -1161,7 +1161,7 @@
                 <w:rFonts w:hint="eastAsia"/>
                 <w:szCs w:val="20"/>
               </w:rPr>
-              <w:t>1）整车档位挂在D档，使车辆运行在匀速</w:t>
+              <w:t>1）整车挡位挂在D挡，使车辆运行在匀速</w:t>
             </w:r>
             <w:r>
               <w:rPr>
@@ -1248,7 +1248,7 @@
                 <w:rFonts w:hint="eastAsia"/>
                 <w:szCs w:val="20"/>
               </w:rPr>
-              <w:t>）整车档位挂在D档，使车辆运行在匀速</w:t>
+              <w:t>）整车挡位挂在D挡，使车辆运行在匀速</w:t>
             </w:r>
             <w:r>
               <w:rPr>
@@ -1571,7 +1571,7 @@
                 <w:rFonts w:hint="eastAsia"/>
                 <w:szCs w:val="20"/>
               </w:rPr>
-              <w:t>将整车档位挂在D档，通过油门，使车辆由</w:t>
+              <w:t>将整车挡位挂在D挡，通过油门，使车辆由</w:t>
             </w:r>
             <w:r>
               <w:rPr>
@@ -1877,7 +1877,7 @@
                 <w:rFonts w:hint="eastAsia"/>
                 <w:szCs w:val="20"/>
               </w:rPr>
-              <w:t>将整车档位挂在D档，使车辆由</w:t>
+              <w:t>将整车挡位挂在D挡，使车辆由</w:t>
             </w:r>
             <w:r>
               <w:rPr>
@@ -2165,7 +2165,7 @@
                 <w:rFonts w:hint="eastAsia"/>
                 <w:szCs w:val="20"/>
               </w:rPr>
-              <w:t>将整车档位挂在D档，通过制动踏板控制车辆由</w:t>
+              <w:t>将整车挡位挂在D挡，通过制动踏板控制车辆由</w:t>
             </w:r>
             <w:r>
               <w:rPr>
@@ -2447,7 +2447,7 @@
                 <w:rFonts w:hint="eastAsia"/>
                 <w:szCs w:val="20"/>
               </w:rPr>
-              <w:t>1）整车档位挂在D档，设置坡度10%，使车速由0加速至</w:t>
+              <w:t>1）整车挡位挂在D挡，设置坡度10%，使车速由0加速至</w:t>
             </w:r>
             <w:r>
               <w:rPr>
@@ -2485,7 +2485,7 @@
                 <w:rFonts w:hint="eastAsia"/>
                 <w:szCs w:val="20"/>
               </w:rPr>
-              <w:t>2）整车档位挂在D档，设置坡度10%，使车辆运行在匀速</w:t>
+              <w:t>2）整车挡位挂在D挡，设置坡度10%，使车辆运行在匀速</w:t>
             </w:r>
             <w:r>
               <w:rPr>
@@ -2523,7 +2523,7 @@
                 <w:rFonts w:hint="eastAsia"/>
                 <w:szCs w:val="20"/>
               </w:rPr>
-              <w:t>3）整车档位挂在D档，设置坡度10%，使车辆运行在匀速</w:t>
+              <w:t>3）整车挡位挂在D挡，设置坡度10%，使车辆运行在匀速</w:t>
             </w:r>
             <w:r>
               <w:rPr>
@@ -2828,7 +2828,7 @@
                 <w:rFonts w:hint="eastAsia"/>
                 <w:szCs w:val="20"/>
               </w:rPr>
-              <w:t>1）整车档位挂在P档，车辆处于静止状态，通过直流充电为整车充电，充电过程持续时间不低于3min，启动空调至最大风量、最低温度，保持30s，关闭空调，保持30s；</w:t>
+              <w:t>1）整车挡位挂在P挡，车辆处于静止状态，通过直流充电为整车充电，充电过程持续时间不低于3min，启动空调至最大风量、最低温度，保持30s，关闭空调，保持30s；</w:t>
             </w:r>
           </w:p>
           <w:p>
@@ -2851,7 +2851,7 @@
                 <w:rFonts w:hint="eastAsia"/>
                 <w:szCs w:val="20"/>
               </w:rPr>
-              <w:t>2）整车档位挂在P档，车辆处于静止状态，通过直流充电为整车充电，充电过程持续时间不低于3min，启动空调至最大风量、最高温度，保持30s，关闭空调，保持30s；</w:t>
+              <w:t>2）整车挡位挂在P挡，车辆处于静止状态，通过直流充电为整车充电，充电过程持续时间不低于3min，启动空调至最大风量、最高温度，保持30s，关闭空调，保持30s；</w:t>
             </w:r>
           </w:p>
         </w:tc>
@@ -3131,7 +3131,7 @@
                 <w:rFonts w:hint="eastAsia"/>
                 <w:szCs w:val="20"/>
               </w:rPr>
-              <w:t>1）整车档位挂在P档，车辆处于静止状态，通过</w:t>
+              <w:t>1）整车挡位挂在P挡，车辆处于静止状态，通过</w:t>
             </w:r>
             <w:r>
               <w:rPr>
@@ -3172,7 +3172,7 @@
                 <w:rFonts w:hint="eastAsia"/>
                 <w:szCs w:val="20"/>
               </w:rPr>
-              <w:t>2）整车档位挂在P档，车辆处于静止状态，通过</w:t>
+              <w:t>2）整车挡位挂在P挡，车辆处于静止状态，通过</w:t>
             </w:r>
             <w:r>
               <w:rPr>
@@ -3541,7 +3541,7 @@
                 <w:rFonts w:hint="default" w:ascii="Times New Roman" w:hAnsi="Times New Roman" w:eastAsiaTheme="minorEastAsia"/>
                 <w:szCs w:val="20"/>
               </w:rPr>
-              <w:t>停车D档工况试验</w:t>
+              <w:t>停车D挡工况试验</w:t>
             </w:r>
             <w:r>
               <w:rPr>
@@ -3713,7 +3713,7 @@
                 <w:rFonts w:hint="default" w:ascii="Times New Roman" w:hAnsi="Times New Roman" w:eastAsiaTheme="minorEastAsia"/>
                 <w:szCs w:val="20"/>
               </w:rPr>
-              <w:t>停车D档工况试验</w:t>
+              <w:t>停车D挡工况试验</w:t>
             </w:r>
             <w:r>
               <w:rPr>
@@ -6540,7 +6540,7 @@
                 <w:rFonts w:hint="eastAsia"/>
                 <w:szCs w:val="20"/>
               </w:rPr>
-              <w:t>停车D档工况</w:t>
+              <w:t>停车D挡工况</w:t>
             </w:r>
           </w:p>
         </w:tc>
@@ -6623,7 +6623,7 @@
                 <w:rFonts w:hint="eastAsia"/>
                 <w:szCs w:val="20"/>
               </w:rPr>
-              <w:t>1）整车档位挂在D档，通过刹车使整车处于静止状态，车速为0km</w:t>
+              <w:t>1）整车挡位挂在D挡，通过刹车使整车处于静止状态，车速为0km</w:t>
             </w:r>
             <w:r>
               <w:rPr>
@@ -6688,7 +6688,7 @@
                 <w:rFonts w:hint="eastAsia"/>
                 <w:szCs w:val="20"/>
               </w:rPr>
-              <w:t>2）整车档位挂在D档，通过刹车使整车处于静止状态，车速为0km</w:t>
+              <w:t>2）整车挡位挂在D挡，通过刹车使整车处于静止状态，车速为0km</w:t>
             </w:r>
             <w:r>
               <w:rPr>
@@ -6991,7 +6991,7 @@
                 <w:rFonts w:hint="eastAsia"/>
                 <w:lang w:eastAsia="zh-CN"/>
               </w:rPr>
-              <w:t>1）整车档位挂在D档，加速踏板开度百分之百，使车速由0加速至100km/h；</w:t>
+              <w:t>1）整车挡位挂在D挡，加速踏板开度百分之百，使车速由0加速至100km/h；</w:t>
             </w:r>
           </w:p>
           <w:p>
@@ -7012,7 +7012,7 @@
                 <w:rFonts w:hint="eastAsia"/>
                 <w:lang w:eastAsia="zh-CN"/>
               </w:rPr>
-              <w:t>2）整车档位挂在D档，加速踏板开度百分之百</w:t>
+              <w:t>2）整车挡位挂在D挡，加速踏板开度百分之百</w:t>
             </w:r>
             <w:r>
               <w:rPr>
@@ -7343,7 +7343,7 @@
                 <w:rFonts w:hint="eastAsia"/>
                 <w:szCs w:val="20"/>
               </w:rPr>
-              <w:t>1）整车档位挂在D档，使车辆运行在匀速</w:t>
+              <w:t>1）整车挡位挂在D挡，使车辆运行在匀速</w:t>
             </w:r>
             <w:r>
               <w:rPr>
@@ -7430,7 +7430,7 @@
                 <w:rFonts w:hint="eastAsia"/>
                 <w:szCs w:val="20"/>
               </w:rPr>
-              <w:t>）整车档位挂在D档，使车辆运行在匀速</w:t>
+              <w:t>）整车挡位挂在D挡，使车辆运行在匀速</w:t>
             </w:r>
             <w:r>
               <w:rPr>
@@ -7753,7 +7753,7 @@
                 <w:rFonts w:hint="eastAsia"/>
                 <w:szCs w:val="20"/>
               </w:rPr>
-              <w:t>将整车档位挂在D档，通过油门，使车辆由</w:t>
+              <w:t>将整车挡位挂在D挡，通过油门，使车辆由</w:t>
             </w:r>
             <w:r>
               <w:rPr>
@@ -8055,7 +8055,7 @@
                 <w:rFonts w:hint="eastAsia"/>
                 <w:szCs w:val="20"/>
               </w:rPr>
-              <w:t>将整车档位挂在D档，使车辆由</w:t>
+              <w:t>将整车挡位挂在D挡，使车辆由</w:t>
             </w:r>
             <w:r>
               <w:rPr>
@@ -8343,7 +8343,7 @@
                 <w:rFonts w:hint="eastAsia"/>
                 <w:szCs w:val="20"/>
               </w:rPr>
-              <w:t>将整车档位挂在D档，通过制动踏板控制车辆由</w:t>
+              <w:t>将整车挡位挂在D挡，通过制动踏板控制车辆由</w:t>
             </w:r>
             <w:r>
               <w:rPr>
@@ -8625,7 +8625,7 @@
                 <w:rFonts w:hint="eastAsia"/>
                 <w:szCs w:val="20"/>
               </w:rPr>
-              <w:t>1）整车档位挂在D档，设置坡度10%，使车速由0加速至</w:t>
+              <w:t>1）整车挡位挂在D挡，设置坡度10%，使车速由0加速至</w:t>
             </w:r>
             <w:r>
               <w:rPr>
@@ -8663,7 +8663,7 @@
                 <w:rFonts w:hint="eastAsia"/>
                 <w:szCs w:val="20"/>
               </w:rPr>
-              <w:t>2）整车档位挂在D档，设置坡度10%，使车辆运行在匀速</w:t>
+              <w:t>2）整车挡位挂在D挡，设置坡度10%，使车辆运行在匀速</w:t>
             </w:r>
             <w:r>
               <w:rPr>
@@ -8701,7 +8701,7 @@
                 <w:rFonts w:hint="eastAsia"/>
                 <w:szCs w:val="20"/>
               </w:rPr>
-              <w:t>3）整车档位挂在D档，设置坡度10%，使车辆运行在匀速</w:t>
+              <w:t>3）整车挡位挂在D挡，设置坡度10%，使车辆运行在匀速</w:t>
             </w:r>
             <w:r>
               <w:rPr>
@@ -9006,7 +9006,7 @@
                 <w:rFonts w:hint="eastAsia"/>
                 <w:szCs w:val="20"/>
               </w:rPr>
-              <w:t>1）整车档位挂在P档，车辆处于静止状态，通过直流充电为整车充电，充电过程持续时间不低于3min，启动空调至最大风量、最低温度，保持30s，关闭空调，保持30s；</w:t>
+              <w:t>1）整车挡位挂在P挡，车辆处于静止状态，通过直流充电为整车充电，充电过程持续时间不低于3min，启动空调至最大风量、最低温度，保持30s，关闭空调，保持30s；</w:t>
             </w:r>
           </w:p>
           <w:p>
@@ -9029,7 +9029,7 @@
                 <w:rFonts w:hint="eastAsia"/>
                 <w:szCs w:val="20"/>
               </w:rPr>
-              <w:t>2）整车档位挂在P档，车辆处于静止状态，通过直流充电为整车充电，充电过程持续时间不低于3min，启动空调至最大风量、最高温度，保持30s，关闭空调，保持30s；</w:t>
+              <w:t>2）整车挡位挂在P挡，车辆处于静止状态，通过直流充电为整车充电，充电过程持续时间不低于3min，启动空调至最大风量、最高温度，保持30s，关闭空调，保持30s；</w:t>
             </w:r>
           </w:p>
         </w:tc>
@@ -9303,7 +9303,7 @@
                 <w:rFonts w:hint="eastAsia"/>
                 <w:szCs w:val="20"/>
               </w:rPr>
-              <w:t>1）整车档位挂在P档，车辆处于静止状态，通过</w:t>
+              <w:t>1）整车挡位挂在P挡，车辆处于静止状态，通过</w:t>
             </w:r>
             <w:r>
               <w:rPr>
@@ -9344,7 +9344,7 @@
                 <w:rFonts w:hint="eastAsia"/>
                 <w:szCs w:val="20"/>
               </w:rPr>
-              <w:t>2）整车档位挂在P档，车辆处于静止状态，通过</w:t>
+              <w:t>2）整车挡位挂在P挡，车辆处于静止状态，通过</w:t>
             </w:r>
             <w:r>
               <w:rPr>
@@ -9720,7 +9720,7 @@
                 <w:rFonts w:hint="default" w:ascii="Times New Roman" w:hAnsi="Times New Roman" w:eastAsiaTheme="minorEastAsia"/>
                 <w:szCs w:val="20"/>
               </w:rPr>
-              <w:t>停车D档工况试验</w:t>
+              <w:t>停车D挡工况试验</w:t>
             </w:r>
             <w:r>
               <w:rPr>
@@ -9892,7 +9892,7 @@
                 <w:rFonts w:hint="default" w:ascii="Times New Roman" w:hAnsi="Times New Roman" w:eastAsiaTheme="minorEastAsia"/>
                 <w:szCs w:val="20"/>
               </w:rPr>
-              <w:t>停车D档工况试验</w:t>
+              <w:t>停车D挡工况试验</w:t>
             </w:r>
             <w:r>
               <w:rPr>
@@ -12726,7 +12726,7 @@
                 <w:rFonts w:hint="eastAsia"/>
                 <w:szCs w:val="20"/>
               </w:rPr>
-              <w:t>停车D档工况</w:t>
+              <w:t>停车D挡工况</w:t>
             </w:r>
           </w:p>
         </w:tc>
@@ -12809,7 +12809,7 @@
                 <w:rFonts w:hint="eastAsia"/>
                 <w:szCs w:val="20"/>
               </w:rPr>
-              <w:t>1）整车档位挂在D档，通过刹车使整车处于静止状态，车速为0km</w:t>
+              <w:t>1）整车挡位挂在D挡，通过刹车使整车处于静止状态，车速为0km</w:t>
             </w:r>
             <w:r>
               <w:rPr>
@@ -12874,7 +12874,7 @@
                 <w:rFonts w:hint="eastAsia"/>
                 <w:szCs w:val="20"/>
               </w:rPr>
-              <w:t>2）整车档位挂在D档，通过刹车使整车处于静止状态，车速为0km</w:t>
+              <w:t>2）整车挡位挂在D挡，通过刹车使整车处于静止状态，车速为0km</w:t>
             </w:r>
             <w:r>
               <w:rPr>
@@ -13177,7 +13177,7 @@
                 <w:rFonts w:hint="eastAsia"/>
                 <w:lang w:eastAsia="zh-CN"/>
               </w:rPr>
-              <w:t>1）整车档位挂在D档，加速踏板开度百分之百，使车速由0加速至100km/h；</w:t>
+              <w:t>1）整车挡位挂在D挡，加速踏板开度百分之百，使车速由0加速至100km/h；</w:t>
             </w:r>
           </w:p>
           <w:p>
@@ -13198,7 +13198,7 @@
                 <w:rFonts w:hint="eastAsia"/>
                 <w:lang w:eastAsia="zh-CN"/>
               </w:rPr>
-              <w:t>2）整车档位挂在D档，加速踏板开度百分之百</w:t>
+              <w:t>2）整车挡位挂在D挡，加速踏板开度百分之百</w:t>
             </w:r>
             <w:r>
               <w:rPr>
@@ -13529,7 +13529,7 @@
                 <w:rFonts w:hint="eastAsia"/>
                 <w:szCs w:val="20"/>
               </w:rPr>
-              <w:t>1）整车档位挂在D档，使车辆运行在匀速</w:t>
+              <w:t>1）整车挡位挂在D挡，使车辆运行在匀速</w:t>
             </w:r>
             <w:r>
               <w:rPr>
@@ -13616,7 +13616,7 @@
                 <w:rFonts w:hint="eastAsia"/>
                 <w:szCs w:val="20"/>
               </w:rPr>
-              <w:t>）整车档位挂在D档，使车辆运行在匀速</w:t>
+              <w:t>）整车挡位挂在D挡，使车辆运行在匀速</w:t>
             </w:r>
             <w:r>
               <w:rPr>
@@ -13939,7 +13939,7 @@
                 <w:rFonts w:hint="eastAsia"/>
                 <w:szCs w:val="20"/>
               </w:rPr>
-              <w:t>将整车档位挂在D档，通过油门，使车辆由</w:t>
+              <w:t>将整车挡位挂在D挡，通过油门，使车辆由</w:t>
             </w:r>
             <w:r>
               <w:rPr>
@@ -14241,7 +14241,7 @@
                 <w:rFonts w:hint="eastAsia"/>
                 <w:szCs w:val="20"/>
               </w:rPr>
-              <w:t>将整车档位挂在D档，使车辆由</w:t>
+              <w:t>将整车挡位挂在D挡，使车辆由</w:t>
             </w:r>
             <w:r>
               <w:rPr>
@@ -14529,7 +14529,7 @@
                 <w:rFonts w:hint="eastAsia"/>
                 <w:szCs w:val="20"/>
               </w:rPr>
-              <w:t>将整车档位挂在D档，通过制动踏板控制车辆由</w:t>
+              <w:t>将整车挡位挂在D挡，通过制动踏板控制车辆由</w:t>
             </w:r>
             <w:r>
               <w:rPr>
@@ -14811,7 +14811,7 @@
                 <w:rFonts w:hint="eastAsia"/>
                 <w:szCs w:val="20"/>
               </w:rPr>
-              <w:t>1）整车档位挂在D档，设置坡度10%，使车速由0加速至</w:t>
+              <w:t>1）整车挡位挂在D挡，设置坡度10%，使车速由0加速至</w:t>
             </w:r>
             <w:r>
               <w:rPr>
@@ -14849,7 +14849,7 @@
                 <w:rFonts w:hint="eastAsia"/>
                 <w:szCs w:val="20"/>
               </w:rPr>
-              <w:t>2）整车档位挂在D档，设置坡度10%，使车辆运行在匀速</w:t>
+              <w:t>2）整车挡位挂在D挡，设置坡度10%，使车辆运行在匀速</w:t>
             </w:r>
             <w:r>
               <w:rPr>
@@ -14887,7 +14887,7 @@
                 <w:rFonts w:hint="eastAsia"/>
                 <w:szCs w:val="20"/>
               </w:rPr>
-              <w:t>3）整车档位挂在D档，设置坡度10%，使车辆运行在匀速</w:t>
+              <w:t>3）整车挡位挂在D挡，设置坡度10%，使车辆运行在匀速</w:t>
             </w:r>
             <w:r>
               <w:rPr>
@@ -15192,7 +15192,7 @@
                 <w:rFonts w:hint="eastAsia"/>
                 <w:szCs w:val="20"/>
               </w:rPr>
-              <w:t>1）整车档位挂在P档，车辆处于静止状态，通过直流充电为整车充电，充电过程持续时间不低于3min，启动空调至最大风量、最低温度，保持30s，关闭空调，保持30s；</w:t>
+              <w:t>1）整车挡位挂在P挡，车辆处于静止状态，通过直流充电为整车充电，充电过程持续时间不低于3min，启动空调至最大风量、最低温度，保持30s，关闭空调，保持30s；</w:t>
             </w:r>
           </w:p>
           <w:p>
@@ -15215,7 +15215,7 @@
                 <w:rFonts w:hint="eastAsia"/>
                 <w:szCs w:val="20"/>
               </w:rPr>
-              <w:t>2）整车档位挂在P档，车辆处于静止状态，通过直流充电为整车充电，充电过程持续时间不低于3min，启动空调至最大风量、最高温度，保持30s，关闭空调，保持30s；</w:t>
+              <w:t>2）整车挡位挂在P挡，车辆处于静止状态，通过直流充电为整车充电，充电过程持续时间不低于3min，启动空调至最大风量、最高温度，保持30s，关闭空调，保持30s；</w:t>
             </w:r>
           </w:p>
         </w:tc>
@@ -15489,7 +15489,7 @@
                 <w:rFonts w:hint="eastAsia"/>
                 <w:szCs w:val="20"/>
               </w:rPr>
-              <w:t>1）整车档位挂在P档，车辆处于静止状态，通过</w:t>
+              <w:t>1）整车挡位挂在P挡，车辆处于静止状态，通过</w:t>
             </w:r>
             <w:r>
               <w:rPr>
@@ -15532,7 +15532,7 @@
                 <w:rFonts w:hint="eastAsia"/>
                 <w:szCs w:val="20"/>
               </w:rPr>
-              <w:t>2）整车档位挂在P档，车辆处于静止状态，通过</w:t>
+              <w:t>2）整车挡位挂在P挡，车辆处于静止状态，通过</w:t>
             </w:r>
             <w:r>
               <w:rPr>
@@ -15896,7 +15896,7 @@
                 <w:rFonts w:hint="default" w:ascii="Times New Roman" w:hAnsi="Times New Roman" w:eastAsiaTheme="minorEastAsia"/>
                 <w:szCs w:val="20"/>
               </w:rPr>
-              <w:t>停车D档工况试验</w:t>
+              <w:t>停车D挡工况试验</w:t>
             </w:r>
             <w:r>
               <w:rPr>
@@ -16068,7 +16068,7 @@
                 <w:rFonts w:hint="default" w:ascii="Times New Roman" w:hAnsi="Times New Roman" w:eastAsiaTheme="minorEastAsia"/>
                 <w:szCs w:val="20"/>
               </w:rPr>
-              <w:t>停车D档工况试验</w:t>
+              <w:t>停车D挡工况试验</w:t>
             </w:r>
             <w:r>
               <w:rPr>

</xml_diff>